<commit_message>
Add exam-format intel + confirmed questions; expand ERP/CRM and L4 from lecture transcripts
</commit_message>
<xml_diff>
--- a/L4 Enterprise.docx
+++ b/L4 Enterprise.docx
@@ -1668,6 +1668,207 @@
           <w:szCs w:val="30"/>
           <w:color w:val="1F3864"/>
         </w:rPr>
+        <w:t xml:space="preserve">Extra concepts the professor emphasized in lecture (from transcript)</w:t>
+      </w:r>
+    </w:p>
+    <w:p>
+      <w:pPr>
+        <w:numPr>
+          <w:ilvl w:val="0"/>
+          <w:numId w:val="1"/>
+        </w:numPr>
+        <w:ind w:left="360" w:hanging="360"/>
+        <w:spacing w:after="60"/>
+      </w:pPr>
+      <w:r>
+        <w:rPr>
+          <w:sz w:val="21"/>
+          <w:szCs w:val="21"/>
+        </w:rPr>
+        <w:t xml:space="preserve">“Complexity is the enemy of reliability” — repeated several times; keep services no more complex than needed. Likely a T/F or concept question.</w:t>
+      </w:r>
+    </w:p>
+    <w:p>
+      <w:pPr>
+        <w:numPr>
+          <w:ilvl w:val="0"/>
+          <w:numId w:val="1"/>
+        </w:numPr>
+        <w:ind w:left="360" w:hanging="360"/>
+        <w:spacing w:after="60"/>
+      </w:pPr>
+      <w:r>
+        <w:rPr>
+          <w:sz w:val="21"/>
+          <w:szCs w:val="21"/>
+        </w:rPr>
+        <w:t xml:space="preserve">CAP theorem — the trade-off behind strong vs eventual consistency; can't have all of Consistency, Availability, Partition-tolerance; strong consistency tanks performance so distributed systems lean on eventual consistency.</w:t>
+      </w:r>
+    </w:p>
+    <w:p>
+      <w:pPr>
+        <w:numPr>
+          <w:ilvl w:val="0"/>
+          <w:numId w:val="1"/>
+        </w:numPr>
+        <w:ind w:left="360" w:hanging="360"/>
+        <w:spacing w:after="60"/>
+      </w:pPr>
+      <w:r>
+        <w:rPr>
+          <w:sz w:val="21"/>
+          <w:szCs w:val="21"/>
+        </w:rPr>
+        <w:t xml:space="preserve">Coupling vs cohesion — loose coupling (a change to one service doesn't force a change in another; preferred) vs high cohesion (keep related behavior together; one primary reason to change).</w:t>
+      </w:r>
+    </w:p>
+    <w:p>
+      <w:pPr>
+        <w:numPr>
+          <w:ilvl w:val="0"/>
+          <w:numId w:val="1"/>
+        </w:numPr>
+        <w:ind w:left="360" w:hanging="360"/>
+        <w:spacing w:after="60"/>
+      </w:pPr>
+      <w:r>
+        <w:rPr>
+          <w:sz w:val="21"/>
+          <w:szCs w:val="21"/>
+        </w:rPr>
+        <w:t xml:space="preserve">Single-writer rule / bounded contexts — each business entity has one owning service + database; others read via API/events, never share tables.</w:t>
+      </w:r>
+    </w:p>
+    <w:p>
+      <w:pPr>
+        <w:numPr>
+          <w:ilvl w:val="0"/>
+          <w:numId w:val="1"/>
+        </w:numPr>
+        <w:ind w:left="360" w:hanging="360"/>
+        <w:spacing w:after="60"/>
+      </w:pPr>
+      <w:r>
+        <w:rPr>
+          <w:sz w:val="21"/>
+          <w:szCs w:val="21"/>
+        </w:rPr>
+        <w:t xml:space="preserve">Anti-patterns / pitfalls: distributed monolith (e.g. Oracle RAC), shared database (bottleneck), premature decomposition, microservice sprawl, technical sprawl.</w:t>
+      </w:r>
+    </w:p>
+    <w:p>
+      <w:pPr>
+        <w:numPr>
+          <w:ilvl w:val="0"/>
+          <w:numId w:val="1"/>
+        </w:numPr>
+        <w:ind w:left="360" w:hanging="360"/>
+        <w:spacing w:after="60"/>
+      </w:pPr>
+      <w:r>
+        <w:rPr>
+          <w:sz w:val="21"/>
+          <w:szCs w:val="21"/>
+        </w:rPr>
+        <w:t xml:space="preserve">Conway's Law (Melvin Conway, 1968): architecture mirrors org communication structure. Inverse Conway's Law: structure teams (small, independent) to produce the architecture you want.</w:t>
+      </w:r>
+    </w:p>
+    <w:p>
+      <w:pPr>
+        <w:numPr>
+          <w:ilvl w:val="0"/>
+          <w:numId w:val="1"/>
+        </w:numPr>
+        <w:ind w:left="360" w:hanging="360"/>
+        <w:spacing w:after="60"/>
+      </w:pPr>
+      <w:r>
+        <w:rPr>
+          <w:sz w:val="21"/>
+          <w:szCs w:val="21"/>
+        </w:rPr>
+        <w:t xml:space="preserve">Evolutionary design via fitness functions — tests + telemetry to check the architecture meets its goals.</w:t>
+      </w:r>
+    </w:p>
+    <w:p>
+      <w:pPr>
+        <w:numPr>
+          <w:ilvl w:val="0"/>
+          <w:numId w:val="1"/>
+        </w:numPr>
+        <w:ind w:left="360" w:hanging="360"/>
+        <w:spacing w:after="60"/>
+      </w:pPr>
+      <w:r>
+        <w:rPr>
+          <w:sz w:val="21"/>
+          <w:szCs w:val="21"/>
+        </w:rPr>
+        <w:t xml:space="preserve">SRE (Site Reliability Engineering): Google-born discipline behind SLI/SLO/SLA/error budget.</w:t>
+      </w:r>
+    </w:p>
+    <w:p>
+      <w:pPr>
+        <w:numPr>
+          <w:ilvl w:val="0"/>
+          <w:numId w:val="1"/>
+        </w:numPr>
+        <w:ind w:left="360" w:hanging="360"/>
+        <w:spacing w:after="60"/>
+      </w:pPr>
+      <w:r>
+        <w:rPr>
+          <w:sz w:val="21"/>
+          <w:szCs w:val="21"/>
+        </w:rPr>
+        <w:t xml:space="preserve">Serverless / FaaS (AWS Lambda): short-running, stateless, event-driven, pay-per-use. Good for: microservice/mobile backends, bots, ML inference, IoT, stream processing. NOT good for: databases, deep-learning training, heavy streaming analytics, numerical simulation, video streaming.</w:t>
+      </w:r>
+    </w:p>
+    <w:p>
+      <w:pPr>
+        <w:numPr>
+          <w:ilvl w:val="0"/>
+          <w:numId w:val="1"/>
+        </w:numPr>
+        <w:ind w:left="360" w:hanging="360"/>
+        <w:spacing w:after="60"/>
+      </w:pPr>
+      <w:r>
+        <w:rPr>
+          <w:sz w:val="21"/>
+          <w:szCs w:val="21"/>
+        </w:rPr>
+        <w:t xml:space="preserve">Prime Video 2023 case study: cut costs ~90% by moving a microservice architecture back to a monolith — the classic 'microservices aren't always right' example.</w:t>
+      </w:r>
+    </w:p>
+    <w:p>
+      <w:pPr>
+        <w:numPr>
+          <w:ilvl w:val="0"/>
+          <w:numId w:val="1"/>
+        </w:numPr>
+        <w:ind w:left="360" w:hanging="360"/>
+        <w:spacing w:after="60"/>
+      </w:pPr>
+      <w:r>
+        <w:rPr>
+          <w:sz w:val="21"/>
+          <w:szCs w:val="21"/>
+        </w:rPr>
+        <w:t xml:space="preserve">Idempotency analogy: old-car key (turning again doesn't change running state = idempotent) vs BMW push-button (each press flips state = not idempotent). 'Exactly-once is an application effect, not a transport guarantee.'</w:t>
+      </w:r>
+    </w:p>
+    <w:p>
+      <w:pPr>
+        <w:spacing w:before="240" w:after="60"/>
+      </w:pPr>
+      <w:r>
+        <w:rPr>
+          <w:b/>
+          <w:sz w:val="30"/>
+          <w:szCs w:val="30"/>
+          <w:color w:val="1F3864"/>
+        </w:rPr>
         <w:t xml:space="preserve">If you only have 15 minutes on L4, nail these</w:t>
       </w:r>
     </w:p>
@@ -1771,6 +1972,23 @@
           <w:szCs w:val="21"/>
         </w:rPr>
         <w:t xml:space="preserve">Circuit breaker; idempotency; the event-driven checklist (contract/delivery/reliability/outbox/observability).</w:t>
+      </w:r>
+    </w:p>
+    <w:p>
+      <w:pPr>
+        <w:numPr>
+          <w:ilvl w:val="0"/>
+          <w:numId w:val="1"/>
+        </w:numPr>
+        <w:ind w:left="360" w:hanging="360"/>
+        <w:spacing w:after="60"/>
+      </w:pPr>
+      <w:r>
+        <w:rPr>
+          <w:sz w:val="21"/>
+          <w:szCs w:val="21"/>
+        </w:rPr>
+        <w:t xml:space="preserve">CAP theorem; Conway's Law; coupling vs cohesion; anti-patterns.</w:t>
       </w:r>
     </w:p>
     <w:sectPr>

</xml_diff>